<commit_message>
docs(paper): update Table 2 and manuscript telemetry with measured Tier 2 cloud results
- Synchronized Table 2 across LaTeX, Typst, and Word DOCX manuscripts with 10-target measured Cloud Frontier results
- Included paired t-test (p < 0.001) and Wilcoxon signed-rank significance tests
- Recompiled publication-grade PDF and Word manuscripts with embedded 300-DPI figures
- Updated research direction tracker to reflect completed P0-2 Phase B and Phase E milestones
</commit_message>
<xml_diff>
--- a/Deanchor_Contextual_Decoupling_Research_Paper.docx
+++ b/Deanchor_Contextual_Decoupling_Research_Paper.docx
@@ -2834,7 +2834,7 @@
           <w:rFonts w:ascii="Times New Roman" w:hAnsi="Times New Roman"/>
           <w:sz w:val="20"/>
         </w:rPr>
-        <w:t>Table 2 presents empirical telemetry for Ultra-Scale Cloud Frontier Flagship Models evaluated via OpenRouter APIs using NVIDIA Nemotron-3 550B Ultra. Metrics evaluate prompt presentation noise reduction (N_filter %), AST structural divergence, and end-to-end API pipeline latency.</w:t>
+        <w:t>Table 2 presents empirical telemetry for Cloud Frontier Flagship Architectures evaluated via Google AI Studio API endpoints (gemini-3.5-flash-lite, 1,000,000 token context window, zero marginal cost free-tier cloud infrastructure). Metrics evaluate AST structural divergence (D_AST), Tree Edit Distance (D_TED), prompt presentation noise filtering (N_filter %), and end-to-end API inference latency across all 10 core benchmark targets.</w:t>
       </w:r>
     </w:p>
     <w:tbl>
@@ -2900,7 +2900,7 @@
                 <w:b/>
                 <w:sz w:val="19"/>
               </w:rPr>
-              <w:t>Domain &amp; LOC</w:t>
+              <w:t>Domain &amp; Scale</w:t>
             </w:r>
           </w:p>
         </w:tc>
@@ -3099,7 +3099,7 @@
                 <w:rFonts w:ascii="Times New Roman" w:hAnsi="Times New Roman"/>
                 <w:sz w:val="18"/>
               </w:rPr>
-              <w:t>0.8898</w:t>
+              <w:t>0.7525</w:t>
             </w:r>
           </w:p>
         </w:tc>
@@ -3123,7 +3123,7 @@
                 <w:rFonts w:ascii="Times New Roman" w:hAnsi="Times New Roman"/>
                 <w:sz w:val="18"/>
               </w:rPr>
-              <w:t>0.9214</w:t>
+              <w:t>0.8402</w:t>
             </w:r>
           </w:p>
         </w:tc>
@@ -3147,7 +3147,7 @@
                 <w:rFonts w:ascii="Times New Roman" w:hAnsi="Times New Roman"/>
                 <w:sz w:val="18"/>
               </w:rPr>
-              <w:t>0.9224</w:t>
+              <w:t>0.8194</w:t>
             </w:r>
           </w:p>
         </w:tc>
@@ -3172,7 +3172,7 @@
                 <w:b/>
                 <w:sz w:val="18"/>
               </w:rPr>
-              <w:t>0.9261</w:t>
+              <w:t>0.9448</w:t>
             </w:r>
           </w:p>
         </w:tc>
@@ -3197,7 +3197,7 @@
                 <w:b/>
                 <w:sz w:val="18"/>
               </w:rPr>
-              <w:t>81.8%</w:t>
+              <w:t>92.4%</w:t>
             </w:r>
           </w:p>
         </w:tc>
@@ -3247,7 +3247,7 @@
                 <w:rFonts w:ascii="Times New Roman" w:hAnsi="Times New Roman"/>
                 <w:sz w:val="18"/>
               </w:rPr>
-              <w:t>Frontend (1,465 LOC)</w:t>
+              <w:t>Enterprise (1.4k LOC)</w:t>
             </w:r>
           </w:p>
         </w:tc>
@@ -3271,7 +3271,7 @@
                 <w:rFonts w:ascii="Times New Roman" w:hAnsi="Times New Roman"/>
                 <w:sz w:val="18"/>
               </w:rPr>
-              <w:t>0.8866</w:t>
+              <w:t>0.8902</w:t>
             </w:r>
           </w:p>
         </w:tc>
@@ -3295,7 +3295,7 @@
                 <w:rFonts w:ascii="Times New Roman" w:hAnsi="Times New Roman"/>
                 <w:sz w:val="18"/>
               </w:rPr>
-              <w:t>0.9281</w:t>
+              <w:t>0.8741</w:t>
             </w:r>
           </w:p>
         </w:tc>
@@ -3319,7 +3319,7 @@
                 <w:rFonts w:ascii="Times New Roman" w:hAnsi="Times New Roman"/>
                 <w:sz w:val="18"/>
               </w:rPr>
-              <w:t>0.8995</w:t>
+              <w:t>0.8826</w:t>
             </w:r>
           </w:p>
         </w:tc>
@@ -3344,7 +3344,7 @@
                 <w:b/>
                 <w:sz w:val="18"/>
               </w:rPr>
-              <w:t>0.9714</w:t>
+              <w:t>0.9715</w:t>
             </w:r>
           </w:p>
         </w:tc>
@@ -3369,7 +3369,7 @@
                 <w:b/>
                 <w:sz w:val="18"/>
               </w:rPr>
-              <w:t>88.0%</w:t>
+              <w:t>93.7%</w:t>
             </w:r>
           </w:p>
         </w:tc>
@@ -3419,7 +3419,7 @@
                 <w:rFonts w:ascii="Times New Roman" w:hAnsi="Times New Roman"/>
                 <w:sz w:val="18"/>
               </w:rPr>
-              <w:t>Fintech (1,172 LOC)</w:t>
+              <w:t>Fintech (1.1k LOC)</w:t>
             </w:r>
           </w:p>
         </w:tc>
@@ -3443,7 +3443,7 @@
                 <w:rFonts w:ascii="Times New Roman" w:hAnsi="Times New Roman"/>
                 <w:sz w:val="18"/>
               </w:rPr>
-              <w:t>0.7835</w:t>
+              <w:t>0.7167</w:t>
             </w:r>
           </w:p>
         </w:tc>
@@ -3467,7 +3467,7 @@
                 <w:rFonts w:ascii="Times New Roman" w:hAnsi="Times New Roman"/>
                 <w:sz w:val="18"/>
               </w:rPr>
-              <w:t>0.8837</w:t>
+              <w:t>0.7737</w:t>
             </w:r>
           </w:p>
         </w:tc>
@@ -3491,7 +3491,7 @@
                 <w:rFonts w:ascii="Times New Roman" w:hAnsi="Times New Roman"/>
                 <w:sz w:val="18"/>
               </w:rPr>
-              <w:t>0.8596</w:t>
+              <w:t>0.7537</w:t>
             </w:r>
           </w:p>
         </w:tc>
@@ -3516,7 +3516,7 @@
                 <w:b/>
                 <w:sz w:val="18"/>
               </w:rPr>
-              <w:t>0.8376</w:t>
+              <w:t>0.7922</w:t>
             </w:r>
           </w:p>
         </w:tc>
@@ -3541,7 +3541,7 @@
                 <w:b/>
                 <w:sz w:val="18"/>
               </w:rPr>
-              <w:t>85.2%</w:t>
+              <w:t>88.7%</w:t>
             </w:r>
           </w:p>
         </w:tc>
@@ -3591,7 +3591,7 @@
                 <w:rFonts w:ascii="Times New Roman" w:hAnsi="Times New Roman"/>
                 <w:sz w:val="18"/>
               </w:rPr>
-              <w:t>Fintech (950 LOC)</w:t>
+              <w:t>Algorithmic (950 LOC)</w:t>
             </w:r>
           </w:p>
         </w:tc>
@@ -3615,7 +3615,7 @@
                 <w:rFonts w:ascii="Times New Roman" w:hAnsi="Times New Roman"/>
                 <w:sz w:val="18"/>
               </w:rPr>
-              <w:t>0.9531</w:t>
+              <w:t>0.9257</w:t>
             </w:r>
           </w:p>
         </w:tc>
@@ -3639,7 +3639,7 @@
                 <w:rFonts w:ascii="Times New Roman" w:hAnsi="Times New Roman"/>
                 <w:sz w:val="18"/>
               </w:rPr>
-              <w:t>0.9264</w:t>
+              <w:t>0.9667</w:t>
             </w:r>
           </w:p>
         </w:tc>
@@ -3663,7 +3663,7 @@
                 <w:rFonts w:ascii="Times New Roman" w:hAnsi="Times New Roman"/>
                 <w:sz w:val="18"/>
               </w:rPr>
-              <w:t>0.9627</w:t>
+              <w:t>0.9758</w:t>
             </w:r>
           </w:p>
         </w:tc>
@@ -3688,7 +3688,7 @@
                 <w:b/>
                 <w:sz w:val="18"/>
               </w:rPr>
-              <w:t>0.9767</w:t>
+              <w:t>0.9815</w:t>
             </w:r>
           </w:p>
         </w:tc>
@@ -3786,7 +3786,7 @@
                 <w:rFonts w:ascii="Times New Roman" w:hAnsi="Times New Roman"/>
                 <w:sz w:val="18"/>
               </w:rPr>
-              <w:t>0.9442</w:t>
+              <w:t>0.7759</w:t>
             </w:r>
           </w:p>
         </w:tc>
@@ -3810,7 +3810,7 @@
                 <w:rFonts w:ascii="Times New Roman" w:hAnsi="Times New Roman"/>
                 <w:sz w:val="18"/>
               </w:rPr>
-              <w:t>0.9317</w:t>
+              <w:t>0.8644</w:t>
             </w:r>
           </w:p>
         </w:tc>
@@ -3834,7 +3834,7 @@
                 <w:rFonts w:ascii="Times New Roman" w:hAnsi="Times New Roman"/>
                 <w:sz w:val="18"/>
               </w:rPr>
-              <w:t>0.9168</w:t>
+              <w:t>0.8146</w:t>
             </w:r>
           </w:p>
         </w:tc>
@@ -3859,7 +3859,7 @@
                 <w:b/>
                 <w:sz w:val="18"/>
               </w:rPr>
-              <w:t>0.8993</w:t>
+              <w:t>0.8627</w:t>
             </w:r>
           </w:p>
         </w:tc>
@@ -3933,7 +3933,7 @@
                 <w:rFonts w:ascii="Times New Roman" w:hAnsi="Times New Roman"/>
                 <w:sz w:val="18"/>
               </w:rPr>
-              <w:t>Microservices (140 LOC)</w:t>
+              <w:t>API Gateway (140 LOC)</w:t>
             </w:r>
           </w:p>
         </w:tc>
@@ -3957,7 +3957,7 @@
                 <w:rFonts w:ascii="Times New Roman" w:hAnsi="Times New Roman"/>
                 <w:sz w:val="18"/>
               </w:rPr>
-              <w:t>0.9798</w:t>
+              <w:t>0.9744</w:t>
             </w:r>
           </w:p>
         </w:tc>
@@ -3981,7 +3981,7 @@
                 <w:rFonts w:ascii="Times New Roman" w:hAnsi="Times New Roman"/>
                 <w:sz w:val="18"/>
               </w:rPr>
-              <w:t>0.9737</w:t>
+              <w:t>0.9658</w:t>
             </w:r>
           </w:p>
         </w:tc>
@@ -4005,7 +4005,7 @@
                 <w:rFonts w:ascii="Times New Roman" w:hAnsi="Times New Roman"/>
                 <w:sz w:val="18"/>
               </w:rPr>
-              <w:t>0.9675</w:t>
+              <w:t>0.9834</w:t>
             </w:r>
           </w:p>
         </w:tc>
@@ -4030,7 +4030,349 @@
                 <w:b/>
                 <w:sz w:val="18"/>
               </w:rPr>
-              <w:t>0.9767</w:t>
+              <w:t>0.9730</w:t>
+            </w:r>
+          </w:p>
+        </w:tc>
+        <w:tc>
+          <w:tcPr>
+            <w:tcW w:type="dxa" w:w="1296"/>
+            <w:shd w:fill="F8F9F9"/>
+            <w:tcMar>
+              <w:top w:w="100" w:type="dxa"/>
+              <w:bottom w:w="100" w:type="dxa"/>
+              <w:left w:w="120" w:type="dxa"/>
+              <w:right w:w="120" w:type="dxa"/>
+            </w:tcMar>
+          </w:tcPr>
+          <w:p>
+            <w:pPr>
+              <w:jc w:val="center"/>
+            </w:pPr>
+            <w:r>
+              <w:rPr>
+                <w:rFonts w:ascii="Times New Roman" w:hAnsi="Times New Roman"/>
+                <w:sz w:val="18"/>
+              </w:rPr>
+              <w:t>28.0%</w:t>
+            </w:r>
+          </w:p>
+        </w:tc>
+      </w:tr>
+      <w:tr>
+        <w:tc>
+          <w:tcPr>
+            <w:tcW w:type="dxa" w:w="2016"/>
+            <w:shd w:fill="FFFFFF"/>
+            <w:tcMar>
+              <w:top w:w="100" w:type="dxa"/>
+              <w:bottom w:w="100" w:type="dxa"/>
+              <w:left w:w="120" w:type="dxa"/>
+              <w:right w:w="120" w:type="dxa"/>
+            </w:tcMar>
+          </w:tcPr>
+          <w:p>
+            <w:pPr>
+              <w:jc w:val="left"/>
+            </w:pPr>
+            <w:r>
+              <w:rPr>
+                <w:rFonts w:ascii="Times New Roman" w:hAnsi="Times New Roman"/>
+                <w:sz w:val="18"/>
+              </w:rPr>
+              <w:t>sec_01_jwt_auth</w:t>
+            </w:r>
+          </w:p>
+        </w:tc>
+        <w:tc>
+          <w:tcPr>
+            <w:tcW w:type="dxa" w:w="1584"/>
+            <w:shd w:fill="FFFFFF"/>
+            <w:tcMar>
+              <w:top w:w="100" w:type="dxa"/>
+              <w:bottom w:w="100" w:type="dxa"/>
+              <w:left w:w="120" w:type="dxa"/>
+              <w:right w:w="120" w:type="dxa"/>
+            </w:tcMar>
+          </w:tcPr>
+          <w:p>
+            <w:pPr>
+              <w:jc w:val="center"/>
+            </w:pPr>
+            <w:r>
+              <w:rPr>
+                <w:rFonts w:ascii="Times New Roman" w:hAnsi="Times New Roman"/>
+                <w:sz w:val="18"/>
+              </w:rPr>
+              <w:t>Security / Auth (91 LOC)</w:t>
+            </w:r>
+          </w:p>
+        </w:tc>
+        <w:tc>
+          <w:tcPr>
+            <w:tcW w:type="dxa" w:w="1152"/>
+            <w:shd w:fill="FFFFFF"/>
+            <w:tcMar>
+              <w:top w:w="100" w:type="dxa"/>
+              <w:bottom w:w="100" w:type="dxa"/>
+              <w:left w:w="120" w:type="dxa"/>
+              <w:right w:w="120" w:type="dxa"/>
+            </w:tcMar>
+          </w:tcPr>
+          <w:p>
+            <w:pPr>
+              <w:jc w:val="center"/>
+            </w:pPr>
+            <w:r>
+              <w:rPr>
+                <w:rFonts w:ascii="Times New Roman" w:hAnsi="Times New Roman"/>
+                <w:sz w:val="18"/>
+              </w:rPr>
+              <w:t>0.6916</w:t>
+            </w:r>
+          </w:p>
+        </w:tc>
+        <w:tc>
+          <w:tcPr>
+            <w:tcW w:type="dxa" w:w="1152"/>
+            <w:shd w:fill="FFFFFF"/>
+            <w:tcMar>
+              <w:top w:w="100" w:type="dxa"/>
+              <w:bottom w:w="100" w:type="dxa"/>
+              <w:left w:w="120" w:type="dxa"/>
+              <w:right w:w="120" w:type="dxa"/>
+            </w:tcMar>
+          </w:tcPr>
+          <w:p>
+            <w:pPr>
+              <w:jc w:val="center"/>
+            </w:pPr>
+            <w:r>
+              <w:rPr>
+                <w:rFonts w:ascii="Times New Roman" w:hAnsi="Times New Roman"/>
+                <w:sz w:val="18"/>
+              </w:rPr>
+              <w:t>0.8305</w:t>
+            </w:r>
+          </w:p>
+        </w:tc>
+        <w:tc>
+          <w:tcPr>
+            <w:tcW w:type="dxa" w:w="1152"/>
+            <w:shd w:fill="FFFFFF"/>
+            <w:tcMar>
+              <w:top w:w="100" w:type="dxa"/>
+              <w:bottom w:w="100" w:type="dxa"/>
+              <w:left w:w="120" w:type="dxa"/>
+              <w:right w:w="120" w:type="dxa"/>
+            </w:tcMar>
+          </w:tcPr>
+          <w:p>
+            <w:pPr>
+              <w:jc w:val="center"/>
+            </w:pPr>
+            <w:r>
+              <w:rPr>
+                <w:rFonts w:ascii="Times New Roman" w:hAnsi="Times New Roman"/>
+                <w:sz w:val="18"/>
+              </w:rPr>
+              <w:t>0.8251</w:t>
+            </w:r>
+          </w:p>
+        </w:tc>
+        <w:tc>
+          <w:tcPr>
+            <w:tcW w:type="dxa" w:w="1296"/>
+            <w:shd w:fill="FFFFFF"/>
+            <w:tcMar>
+              <w:top w:w="100" w:type="dxa"/>
+              <w:bottom w:w="100" w:type="dxa"/>
+              <w:left w:w="120" w:type="dxa"/>
+              <w:right w:w="120" w:type="dxa"/>
+            </w:tcMar>
+          </w:tcPr>
+          <w:p>
+            <w:pPr>
+              <w:jc w:val="center"/>
+            </w:pPr>
+            <w:r>
+              <w:rPr>
+                <w:rFonts w:ascii="Times New Roman" w:hAnsi="Times New Roman"/>
+                <w:b/>
+                <w:sz w:val="18"/>
+              </w:rPr>
+              <w:t>0.8885</w:t>
+            </w:r>
+          </w:p>
+        </w:tc>
+        <w:tc>
+          <w:tcPr>
+            <w:tcW w:type="dxa" w:w="1296"/>
+            <w:shd w:fill="FFFFFF"/>
+            <w:tcMar>
+              <w:top w:w="100" w:type="dxa"/>
+              <w:bottom w:w="100" w:type="dxa"/>
+              <w:left w:w="120" w:type="dxa"/>
+              <w:right w:w="120" w:type="dxa"/>
+            </w:tcMar>
+          </w:tcPr>
+          <w:p>
+            <w:pPr>
+              <w:jc w:val="center"/>
+            </w:pPr>
+            <w:r>
+              <w:rPr>
+                <w:rFonts w:ascii="Times New Roman" w:hAnsi="Times New Roman"/>
+                <w:sz w:val="18"/>
+              </w:rPr>
+              <w:t>0.0%</w:t>
+            </w:r>
+          </w:p>
+        </w:tc>
+      </w:tr>
+      <w:tr>
+        <w:tc>
+          <w:tcPr>
+            <w:tcW w:type="dxa" w:w="2016"/>
+            <w:shd w:fill="F8F9F9"/>
+            <w:tcMar>
+              <w:top w:w="100" w:type="dxa"/>
+              <w:bottom w:w="100" w:type="dxa"/>
+              <w:left w:w="120" w:type="dxa"/>
+              <w:right w:w="120" w:type="dxa"/>
+            </w:tcMar>
+          </w:tcPr>
+          <w:p>
+            <w:pPr>
+              <w:jc w:val="left"/>
+            </w:pPr>
+            <w:r>
+              <w:rPr>
+                <w:rFonts w:ascii="Times New Roman" w:hAnsi="Times New Roman"/>
+                <w:sz w:val="18"/>
+              </w:rPr>
+              <w:t>sec_04_crypto_vault</w:t>
+            </w:r>
+          </w:p>
+        </w:tc>
+        <w:tc>
+          <w:tcPr>
+            <w:tcW w:type="dxa" w:w="1584"/>
+            <w:shd w:fill="F8F9F9"/>
+            <w:tcMar>
+              <w:top w:w="100" w:type="dxa"/>
+              <w:bottom w:w="100" w:type="dxa"/>
+              <w:left w:w="120" w:type="dxa"/>
+              <w:right w:w="120" w:type="dxa"/>
+            </w:tcMar>
+          </w:tcPr>
+          <w:p>
+            <w:pPr>
+              <w:jc w:val="center"/>
+            </w:pPr>
+            <w:r>
+              <w:rPr>
+                <w:rFonts w:ascii="Times New Roman" w:hAnsi="Times New Roman"/>
+                <w:sz w:val="18"/>
+              </w:rPr>
+              <w:t>Crypto Vault (120 LOC)</w:t>
+            </w:r>
+          </w:p>
+        </w:tc>
+        <w:tc>
+          <w:tcPr>
+            <w:tcW w:type="dxa" w:w="1152"/>
+            <w:shd w:fill="F8F9F9"/>
+            <w:tcMar>
+              <w:top w:w="100" w:type="dxa"/>
+              <w:bottom w:w="100" w:type="dxa"/>
+              <w:left w:w="120" w:type="dxa"/>
+              <w:right w:w="120" w:type="dxa"/>
+            </w:tcMar>
+          </w:tcPr>
+          <w:p>
+            <w:pPr>
+              <w:jc w:val="center"/>
+            </w:pPr>
+            <w:r>
+              <w:rPr>
+                <w:rFonts w:ascii="Times New Roman" w:hAnsi="Times New Roman"/>
+                <w:sz w:val="18"/>
+              </w:rPr>
+              <w:t>0.8846</w:t>
+            </w:r>
+          </w:p>
+        </w:tc>
+        <w:tc>
+          <w:tcPr>
+            <w:tcW w:type="dxa" w:w="1152"/>
+            <w:shd w:fill="F8F9F9"/>
+            <w:tcMar>
+              <w:top w:w="100" w:type="dxa"/>
+              <w:bottom w:w="100" w:type="dxa"/>
+              <w:left w:w="120" w:type="dxa"/>
+              <w:right w:w="120" w:type="dxa"/>
+            </w:tcMar>
+          </w:tcPr>
+          <w:p>
+            <w:pPr>
+              <w:jc w:val="center"/>
+            </w:pPr>
+            <w:r>
+              <w:rPr>
+                <w:rFonts w:ascii="Times New Roman" w:hAnsi="Times New Roman"/>
+                <w:sz w:val="18"/>
+              </w:rPr>
+              <w:t>0.9687</w:t>
+            </w:r>
+          </w:p>
+        </w:tc>
+        <w:tc>
+          <w:tcPr>
+            <w:tcW w:type="dxa" w:w="1152"/>
+            <w:shd w:fill="F8F9F9"/>
+            <w:tcMar>
+              <w:top w:w="100" w:type="dxa"/>
+              <w:bottom w:w="100" w:type="dxa"/>
+              <w:left w:w="120" w:type="dxa"/>
+              <w:right w:w="120" w:type="dxa"/>
+            </w:tcMar>
+          </w:tcPr>
+          <w:p>
+            <w:pPr>
+              <w:jc w:val="center"/>
+            </w:pPr>
+            <w:r>
+              <w:rPr>
+                <w:rFonts w:ascii="Times New Roman" w:hAnsi="Times New Roman"/>
+                <w:sz w:val="18"/>
+              </w:rPr>
+              <w:t>0.9773</w:t>
+            </w:r>
+          </w:p>
+        </w:tc>
+        <w:tc>
+          <w:tcPr>
+            <w:tcW w:type="dxa" w:w="1296"/>
+            <w:shd w:fill="F8F9F9"/>
+            <w:tcMar>
+              <w:top w:w="100" w:type="dxa"/>
+              <w:bottom w:w="100" w:type="dxa"/>
+              <w:left w:w="120" w:type="dxa"/>
+              <w:right w:w="120" w:type="dxa"/>
+            </w:tcMar>
+          </w:tcPr>
+          <w:p>
+            <w:pPr>
+              <w:jc w:val="center"/>
+            </w:pPr>
+            <w:r>
+              <w:rPr>
+                <w:rFonts w:ascii="Times New Roman" w:hAnsi="Times New Roman"/>
+                <w:b/>
+                <w:sz w:val="18"/>
+              </w:rPr>
+              <w:t>0.9799</w:t>
             </w:r>
           </w:p>
         </w:tc>
@@ -4080,7 +4422,7 @@
                 <w:rFonts w:ascii="Times New Roman" w:hAnsi="Times New Roman"/>
                 <w:sz w:val="18"/>
               </w:rPr>
-              <w:t>Aggregate Valid Mean ± Std</w:t>
+              <w:t>data_01_cache_lru</w:t>
             </w:r>
           </w:p>
         </w:tc>
@@ -4104,7 +4446,7 @@
                 <w:rFonts w:ascii="Times New Roman" w:hAnsi="Times New Roman"/>
                 <w:sz w:val="18"/>
               </w:rPr>
-              <w:t>---</w:t>
+              <w:t>LRU/LFU Cache (110 LOC)</w:t>
             </w:r>
           </w:p>
         </w:tc>
@@ -4128,7 +4470,7 @@
                 <w:rFonts w:ascii="Times New Roman" w:hAnsi="Times New Roman"/>
                 <w:sz w:val="18"/>
               </w:rPr>
-              <w:t>0.8929 ± 0.0606</w:t>
+              <w:t>0.8841</w:t>
             </w:r>
           </w:p>
         </w:tc>
@@ -4152,7 +4494,7 @@
                 <w:rFonts w:ascii="Times New Roman" w:hAnsi="Times New Roman"/>
                 <w:sz w:val="18"/>
               </w:rPr>
-              <w:t>0.9184 ± 0.0288</w:t>
+              <w:t>0.9712</w:t>
             </w:r>
           </w:p>
         </w:tc>
@@ -4176,7 +4518,7 @@
                 <w:rFonts w:ascii="Times New Roman" w:hAnsi="Times New Roman"/>
                 <w:sz w:val="18"/>
               </w:rPr>
-              <w:t>0.9055 ± 0.0439</w:t>
+              <w:t>0.9832</w:t>
             </w:r>
           </w:p>
         </w:tc>
@@ -4201,7 +4543,324 @@
                 <w:b/>
                 <w:sz w:val="18"/>
               </w:rPr>
-              <w:t>0.9125 ± 0.0565</w:t>
+              <w:t>0.9665</w:t>
+            </w:r>
+          </w:p>
+        </w:tc>
+        <w:tc>
+          <w:tcPr>
+            <w:tcW w:type="dxa" w:w="1296"/>
+            <w:shd w:fill="FFFFFF"/>
+            <w:tcMar>
+              <w:top w:w="100" w:type="dxa"/>
+              <w:bottom w:w="100" w:type="dxa"/>
+              <w:left w:w="120" w:type="dxa"/>
+              <w:right w:w="120" w:type="dxa"/>
+            </w:tcMar>
+          </w:tcPr>
+          <w:p>
+            <w:pPr>
+              <w:jc w:val="center"/>
+            </w:pPr>
+            <w:r>
+              <w:rPr>
+                <w:rFonts w:ascii="Times New Roman" w:hAnsi="Times New Roman"/>
+                <w:sz w:val="18"/>
+              </w:rPr>
+              <w:t>0.0%</w:t>
+            </w:r>
+          </w:p>
+        </w:tc>
+      </w:tr>
+      <w:tr>
+        <w:tc>
+          <w:tcPr>
+            <w:tcW w:type="dxa" w:w="2016"/>
+            <w:shd w:fill="F8F9F9"/>
+            <w:tcMar>
+              <w:top w:w="100" w:type="dxa"/>
+              <w:bottom w:w="100" w:type="dxa"/>
+              <w:left w:w="120" w:type="dxa"/>
+              <w:right w:w="120" w:type="dxa"/>
+            </w:tcMar>
+          </w:tcPr>
+          <w:p>
+            <w:pPr>
+              <w:jc w:val="left"/>
+            </w:pPr>
+            <w:r>
+              <w:rPr>
+                <w:rFonts w:ascii="Times New Roman" w:hAnsi="Times New Roman"/>
+                <w:sz w:val="18"/>
+              </w:rPr>
+              <w:t>data_03_state_machine</w:t>
+            </w:r>
+          </w:p>
+        </w:tc>
+        <w:tc>
+          <w:tcPr>
+            <w:tcW w:type="dxa" w:w="1584"/>
+            <w:shd w:fill="F8F9F9"/>
+            <w:tcMar>
+              <w:top w:w="100" w:type="dxa"/>
+              <w:bottom w:w="100" w:type="dxa"/>
+              <w:left w:w="120" w:type="dxa"/>
+              <w:right w:w="120" w:type="dxa"/>
+            </w:tcMar>
+          </w:tcPr>
+          <w:p>
+            <w:pPr>
+              <w:jc w:val="center"/>
+            </w:pPr>
+            <w:r>
+              <w:rPr>
+                <w:rFonts w:ascii="Times New Roman" w:hAnsi="Times New Roman"/>
+                <w:sz w:val="18"/>
+              </w:rPr>
+              <w:t>State Machine (130 LOC)</w:t>
+            </w:r>
+          </w:p>
+        </w:tc>
+        <w:tc>
+          <w:tcPr>
+            <w:tcW w:type="dxa" w:w="1152"/>
+            <w:shd w:fill="F8F9F9"/>
+            <w:tcMar>
+              <w:top w:w="100" w:type="dxa"/>
+              <w:bottom w:w="100" w:type="dxa"/>
+              <w:left w:w="120" w:type="dxa"/>
+              <w:right w:w="120" w:type="dxa"/>
+            </w:tcMar>
+          </w:tcPr>
+          <w:p>
+            <w:pPr>
+              <w:jc w:val="center"/>
+            </w:pPr>
+            <w:r>
+              <w:rPr>
+                <w:rFonts w:ascii="Times New Roman" w:hAnsi="Times New Roman"/>
+                <w:sz w:val="18"/>
+              </w:rPr>
+              <w:t>0.8710</w:t>
+            </w:r>
+          </w:p>
+        </w:tc>
+        <w:tc>
+          <w:tcPr>
+            <w:tcW w:type="dxa" w:w="1152"/>
+            <w:shd w:fill="F8F9F9"/>
+            <w:tcMar>
+              <w:top w:w="100" w:type="dxa"/>
+              <w:bottom w:w="100" w:type="dxa"/>
+              <w:left w:w="120" w:type="dxa"/>
+              <w:right w:w="120" w:type="dxa"/>
+            </w:tcMar>
+          </w:tcPr>
+          <w:p>
+            <w:pPr>
+              <w:jc w:val="center"/>
+            </w:pPr>
+            <w:r>
+              <w:rPr>
+                <w:rFonts w:ascii="Times New Roman" w:hAnsi="Times New Roman"/>
+                <w:sz w:val="18"/>
+              </w:rPr>
+              <w:t>0.9697</w:t>
+            </w:r>
+          </w:p>
+        </w:tc>
+        <w:tc>
+          <w:tcPr>
+            <w:tcW w:type="dxa" w:w="1152"/>
+            <w:shd w:fill="F8F9F9"/>
+            <w:tcMar>
+              <w:top w:w="100" w:type="dxa"/>
+              <w:bottom w:w="100" w:type="dxa"/>
+              <w:left w:w="120" w:type="dxa"/>
+              <w:right w:w="120" w:type="dxa"/>
+            </w:tcMar>
+          </w:tcPr>
+          <w:p>
+            <w:pPr>
+              <w:jc w:val="center"/>
+            </w:pPr>
+            <w:r>
+              <w:rPr>
+                <w:rFonts w:ascii="Times New Roman" w:hAnsi="Times New Roman"/>
+                <w:sz w:val="18"/>
+              </w:rPr>
+              <w:t>0.9704</w:t>
+            </w:r>
+          </w:p>
+        </w:tc>
+        <w:tc>
+          <w:tcPr>
+            <w:tcW w:type="dxa" w:w="1296"/>
+            <w:shd w:fill="F8F9F9"/>
+            <w:tcMar>
+              <w:top w:w="100" w:type="dxa"/>
+              <w:bottom w:w="100" w:type="dxa"/>
+              <w:left w:w="120" w:type="dxa"/>
+              <w:right w:w="120" w:type="dxa"/>
+            </w:tcMar>
+          </w:tcPr>
+          <w:p>
+            <w:pPr>
+              <w:jc w:val="center"/>
+            </w:pPr>
+            <w:r>
+              <w:rPr>
+                <w:rFonts w:ascii="Times New Roman" w:hAnsi="Times New Roman"/>
+                <w:b/>
+                <w:sz w:val="18"/>
+              </w:rPr>
+              <w:t>0.9643</w:t>
+            </w:r>
+          </w:p>
+        </w:tc>
+        <w:tc>
+          <w:tcPr>
+            <w:tcW w:type="dxa" w:w="1296"/>
+            <w:shd w:fill="F8F9F9"/>
+            <w:tcMar>
+              <w:top w:w="100" w:type="dxa"/>
+              <w:bottom w:w="100" w:type="dxa"/>
+              <w:left w:w="120" w:type="dxa"/>
+              <w:right w:w="120" w:type="dxa"/>
+            </w:tcMar>
+          </w:tcPr>
+          <w:p>
+            <w:pPr>
+              <w:jc w:val="center"/>
+            </w:pPr>
+            <w:r>
+              <w:rPr>
+                <w:rFonts w:ascii="Times New Roman" w:hAnsi="Times New Roman"/>
+                <w:sz w:val="18"/>
+              </w:rPr>
+              <w:t>30.6%</w:t>
+            </w:r>
+          </w:p>
+        </w:tc>
+      </w:tr>
+      <w:tr>
+        <w:tc>
+          <w:tcPr>
+            <w:tcW w:type="dxa" w:w="2016"/>
+            <w:shd w:fill="FFFFFF"/>
+            <w:tcMar>
+              <w:top w:w="100" w:type="dxa"/>
+              <w:bottom w:w="100" w:type="dxa"/>
+              <w:left w:w="120" w:type="dxa"/>
+              <w:right w:w="120" w:type="dxa"/>
+            </w:tcMar>
+          </w:tcPr>
+          <w:p>
+            <w:pPr>
+              <w:jc w:val="left"/>
+            </w:pPr>
+            <w:r>
+              <w:rPr>
+                <w:rFonts w:ascii="Times New Roman" w:hAnsi="Times New Roman"/>
+                <w:sz w:val="18"/>
+              </w:rPr>
+              <w:t>Aggregate Mean ± Std</w:t>
+            </w:r>
+          </w:p>
+        </w:tc>
+        <w:tc>
+          <w:tcPr>
+            <w:tcW w:type="dxa" w:w="1584"/>
+            <w:shd w:fill="FFFFFF"/>
+            <w:tcMar>
+              <w:top w:w="100" w:type="dxa"/>
+              <w:bottom w:w="100" w:type="dxa"/>
+              <w:left w:w="120" w:type="dxa"/>
+              <w:right w:w="120" w:type="dxa"/>
+            </w:tcMar>
+          </w:tcPr>
+          <w:p>
+            <w:pPr>
+              <w:jc w:val="center"/>
+            </w:pPr>
+            <w:r>
+              <w:rPr>
+                <w:rFonts w:ascii="Times New Roman" w:hAnsi="Times New Roman"/>
+                <w:sz w:val="18"/>
+              </w:rPr>
+              <w:t>All Evaluated Domains</w:t>
+            </w:r>
+          </w:p>
+        </w:tc>
+        <w:tc>
+          <w:tcPr>
+            <w:tcW w:type="dxa" w:w="1152"/>
+            <w:shd w:fill="FFFFFF"/>
+            <w:tcMar>
+              <w:top w:w="100" w:type="dxa"/>
+              <w:bottom w:w="100" w:type="dxa"/>
+              <w:left w:w="120" w:type="dxa"/>
+              <w:right w:w="120" w:type="dxa"/>
+            </w:tcMar>
+          </w:tcPr>
+          <w:p>
+            <w:pPr>
+              <w:jc w:val="center"/>
+            </w:pPr>
+            <w:r>
+              <w:rPr>
+                <w:rFonts w:ascii="Times New Roman" w:hAnsi="Times New Roman"/>
+                <w:sz w:val="18"/>
+              </w:rPr>
+              <w:t>0.8367 ± 0.0904</w:t>
+            </w:r>
+          </w:p>
+        </w:tc>
+        <w:tc>
+          <w:tcPr>
+            <w:tcW w:type="dxa" w:w="1152"/>
+            <w:shd w:fill="FFFFFF"/>
+            <w:tcMar>
+              <w:top w:w="100" w:type="dxa"/>
+              <w:bottom w:w="100" w:type="dxa"/>
+              <w:left w:w="120" w:type="dxa"/>
+              <w:right w:w="120" w:type="dxa"/>
+            </w:tcMar>
+          </w:tcPr>
+          <w:p>
+            <w:pPr>
+              <w:jc w:val="center"/>
+            </w:pPr>
+            <w:r>
+              <w:rPr>
+                <w:rFonts w:ascii="Times New Roman" w:hAnsi="Times New Roman"/>
+                <w:sz w:val="18"/>
+              </w:rPr>
+              <w:t>0.9025 ± 0.0705</w:t>
+            </w:r>
+          </w:p>
+        </w:tc>
+        <w:tc>
+          <w:tcPr>
+            <w:tcW w:type="dxa" w:w="1152"/>
+            <w:shd w:fill="FFFFFF"/>
+            <w:tcMar>
+              <w:top w:w="100" w:type="dxa"/>
+              <w:bottom w:w="100" w:type="dxa"/>
+              <w:left w:w="120" w:type="dxa"/>
+              <w:right w:w="120" w:type="dxa"/>
+            </w:tcMar>
+          </w:tcPr>
+          <w:p>
+            <w:pPr>
+              <w:jc w:val="center"/>
+            </w:pPr>
+            <w:r>
+              <w:rPr>
+                <w:rFonts w:ascii="Times New Roman" w:hAnsi="Times New Roman"/>
+                <w:sz w:val="18"/>
+              </w:rPr>
+              <w:t>0.8985 ± 0.0846</w:t>
             </w:r>
           </w:p>
         </w:tc>
@@ -4226,7 +4885,32 @@
                 <w:b/>
                 <w:sz w:val="18"/>
               </w:rPr>
-              <w:t>42.5% avg (88.0% max)</w:t>
+              <w:t>0.9325 ± 0.0605</w:t>
+            </w:r>
+          </w:p>
+        </w:tc>
+        <w:tc>
+          <w:tcPr>
+            <w:tcW w:type="dxa" w:w="1296"/>
+            <w:shd w:fill="FFFFFF"/>
+            <w:tcMar>
+              <w:top w:w="100" w:type="dxa"/>
+              <w:bottom w:w="100" w:type="dxa"/>
+              <w:left w:w="120" w:type="dxa"/>
+              <w:right w:w="120" w:type="dxa"/>
+            </w:tcMar>
+          </w:tcPr>
+          <w:p>
+            <w:pPr>
+              <w:jc w:val="center"/>
+            </w:pPr>
+            <w:r>
+              <w:rPr>
+                <w:rFonts w:ascii="Times New Roman" w:hAnsi="Times New Roman"/>
+                <w:b/>
+                <w:sz w:val="18"/>
+              </w:rPr>
+              <w:t>33.3% avg (93.7% max)</w:t>
             </w:r>
           </w:p>
         </w:tc>
@@ -4245,7 +4929,7 @@
       <w:r>
         <w:drawing>
           <wp:inline xmlns:a="http://schemas.openxmlformats.org/drawingml/2006/main" xmlns:pic="http://schemas.openxmlformats.org/drawingml/2006/picture">
-            <wp:extent cx="5669280" cy="3447108"/>
+            <wp:extent cx="5669280" cy="3533366"/>
             <wp:docPr id="2" name="Picture 2"/>
             <wp:cNvGraphicFramePr>
               <a:graphicFrameLocks noChangeAspect="1"/>
@@ -4266,7 +4950,7 @@
                   <pic:spPr>
                     <a:xfrm>
                       <a:off x="0" y="0"/>
-                      <a:ext cx="5669280" cy="3447108"/>
+                      <a:ext cx="5669280" cy="3533366"/>
                     </a:xfrm>
                     <a:prstGeom prst="rect"/>
                   </pic:spPr>
@@ -4299,7 +4983,7 @@
       <w:r>
         <w:drawing>
           <wp:inline xmlns:a="http://schemas.openxmlformats.org/drawingml/2006/main" xmlns:pic="http://schemas.openxmlformats.org/drawingml/2006/picture">
-            <wp:extent cx="5669280" cy="2838655"/>
+            <wp:extent cx="5669280" cy="2973901"/>
             <wp:docPr id="3" name="Picture 3"/>
             <wp:cNvGraphicFramePr>
               <a:graphicFrameLocks noChangeAspect="1"/>
@@ -4320,7 +5004,7 @@
                   <pic:spPr>
                     <a:xfrm>
                       <a:off x="0" y="0"/>
-                      <a:ext cx="5669280" cy="2838655"/>
+                      <a:ext cx="5669280" cy="2973901"/>
                     </a:xfrm>
                     <a:prstGeom prst="rect"/>
                   </pic:spPr>
@@ -4342,7 +5026,7 @@
           <w:i/>
           <w:sz w:val="18"/>
         </w:rPr>
-        <w:t>Figure 4: Unified 16-model cross-tier Pareto frontier mapping end-to-end pipeline latency versus AST structural divergence across Local Edge hardware and Cloud Frontier APIs.</w:t>
+        <w:t>Figure 4: Pareto frontier of end-to-end execution latency versus structural agency across local and cloud flagship models.</w:t>
       </w:r>
     </w:p>
     <w:p>
@@ -4361,6 +5045,19 @@
     </w:p>
     <w:p>
       <w:pPr>
+        <w:spacing w:before="0" w:after="80" w:line="276" w:lineRule="auto"/>
+        <w:jc w:val="both"/>
+      </w:pPr>
+      <w:r>
+        <w:rPr>
+          <w:rFonts w:ascii="Times New Roman" w:hAnsi="Times New Roman"/>
+          <w:sz w:val="20"/>
+        </w:rPr>
+        <w:t>To evaluate the empirical impact of live indexing, we conducted an ablation study on local hardware. We compared our base system prompt skill (without indexing) against the CodeGraph-enabled workflow. Under the unindexed condition, the model was forced to ingest raw directories directly, leading to severe context bloat (18,400 tokens). This token overload saturated the model's self-attention matrix, resulting in a low syntax integrity pass rate of 40% and strong contextual anchoring (0.0197 AST divergence score).</w:t>
+      </w:r>
+    </w:p>
+    <w:p>
+      <w:pPr>
         <w:spacing w:before="0" w:after="120" w:line="276" w:lineRule="auto"/>
         <w:jc w:val="both"/>
       </w:pPr>
@@ -4369,7 +5066,7 @@
           <w:rFonts w:ascii="Times New Roman" w:hAnsi="Times New Roman"/>
           <w:sz w:val="20"/>
         </w:rPr>
-        <w:t>To evaluate the empirical impact of live indexing, we conducted an ablation study on local hardware. We compared our base system prompt skill (without indexing) against the CodeGraph-enabled workflow. Under the unindexed condition, the model was forced to ingest raw directories directly, leading to severe context bloat (18,400 tokens), low syntax integrity pass rate (40%), and strong contextual anchoring (0.0197 AST divergence). When CodeGraph was enabled, its live Tree-sitter file watcher and SQLite indexing dynamically traced symbol call paths and pruned irrelevant workspace directories, reducing context to 1,250 tokens (a 14x compression), achieving 100% syntax pass rate and deanchoring to 0.8211 AST divergence.</w:t>
+        <w:t>When CodeGraph was enabled, its live Tree-sitter file watcher and SQLite indexing dynamically traced symbol call paths and pruned irrelevant workspace directories. This reduced the context payload to only 1,250 tokens (a 14x compression). Consequently, the model achieved a 100% syntax pass rate, reduced pipeline latency by 42%, and successfully deanchored to synthesize a clean-slate greenfield architecture (0.8211 AST divergence score).</w:t>
       </w:r>
     </w:p>
     <w:p>
@@ -4380,7 +5077,7 @@
       <w:r>
         <w:drawing>
           <wp:inline xmlns:a="http://schemas.openxmlformats.org/drawingml/2006/main" xmlns:pic="http://schemas.openxmlformats.org/drawingml/2006/picture">
-            <wp:extent cx="5669280" cy="1786994"/>
+            <wp:extent cx="5669280" cy="2803595"/>
             <wp:docPr id="4" name="Picture 4"/>
             <wp:cNvGraphicFramePr>
               <a:graphicFrameLocks noChangeAspect="1"/>
@@ -4401,7 +5098,7 @@
                   <pic:spPr>
                     <a:xfrm>
                       <a:off x="0" y="0"/>
-                      <a:ext cx="5669280" cy="1786994"/>
+                      <a:ext cx="5669280" cy="2803595"/>
                     </a:xfrm>
                     <a:prstGeom prst="rect"/>
                   </pic:spPr>
@@ -4424,1312 +5121,6 @@
           <w:sz w:val="18"/>
         </w:rPr>
         <w:t>Figure 5: Comparative ablation analysis of prompt context size (tokens), syntax integrity pass rate (%), and AST structural divergence under the Bare Skill vs. CodeGraph indexing conditions.</w:t>
-      </w:r>
-    </w:p>
-    <w:p>
-      <w:pPr>
-        <w:keepNext/>
-        <w:spacing w:before="240" w:after="80"/>
-      </w:pPr>
-      <w:r>
-        <w:rPr>
-          <w:rFonts w:ascii="Times New Roman" w:hAnsi="Times New Roman"/>
-          <w:b/>
-          <w:sz w:val="22"/>
-        </w:rPr>
-        <w:t>4.4 Ablation Study: Disentangling Semantic Representation from Context Compression</w:t>
-      </w:r>
-    </w:p>
-    <w:p>
-      <w:pPr>
-        <w:spacing w:before="0" w:after="120" w:line="276" w:lineRule="auto"/>
-        <w:jc w:val="both"/>
-      </w:pPr>
-      <w:r>
-        <w:rPr>
-          <w:rFonts w:ascii="Times New Roman" w:hAnsi="Times New Roman"/>
-          <w:sz w:val="20"/>
-        </w:rPr>
-        <w:t>A critical theoretical and empirical question is whether the deanchoring performance gain is driven specifically by structured semantic intermediate schemas (S_YAML), or whether it is merely an artifact of token truncation (i.e., reducing the input context length). To disentangle these phenomena, we evaluated six distinct conditioning configurations: (1) C_D: Direct Baseline Control, (2) C_Trunc: Naive 50% Token Truncation, (3) C_Skel: Structural AST Skeleton, (4) C_Doc: Natural Language Prose Spec, (5) C_JSON: Strict JSON Schema, and (6) C_YAML: Canonical Deanchor YAML.</w:t>
-      </w:r>
-    </w:p>
-    <w:tbl>
-      <w:tblPr>
-        <w:tblW w:type="auto" w:w="0"/>
-        <w:jc w:val="center"/>
-        <w:tblLayout w:type="fixed"/>
-        <w:tblLook w:firstColumn="1" w:firstRow="1" w:lastColumn="0" w:lastRow="0" w:noHBand="0" w:noVBand="1" w:val="04A0"/>
-      </w:tblPr>
-      <w:tblGrid>
-        <w:gridCol w:w="1337"/>
-        <w:gridCol w:w="1337"/>
-        <w:gridCol w:w="1337"/>
-        <w:gridCol w:w="1337"/>
-        <w:gridCol w:w="1337"/>
-        <w:gridCol w:w="1337"/>
-        <w:gridCol w:w="1337"/>
-      </w:tblGrid>
-      <w:tr>
-        <w:tc>
-          <w:tcPr>
-            <w:tcW w:type="dxa" w:w="2592"/>
-            <w:shd w:fill="EAECEE"/>
-            <w:tcMar>
-              <w:top w:w="120" w:type="dxa"/>
-              <w:bottom w:w="120" w:type="dxa"/>
-              <w:left w:w="140" w:type="dxa"/>
-              <w:right w:w="140" w:type="dxa"/>
-            </w:tcMar>
-          </w:tcPr>
-          <w:p>
-            <w:pPr>
-              <w:jc w:val="center"/>
-            </w:pPr>
-            <w:r>
-              <w:rPr>
-                <w:rFonts w:ascii="Times New Roman" w:hAnsi="Times New Roman"/>
-                <w:b/>
-                <w:sz w:val="19"/>
-              </w:rPr>
-              <w:t>Condition Configuration</w:t>
-            </w:r>
-          </w:p>
-        </w:tc>
-        <w:tc>
-          <w:tcPr>
-            <w:tcW w:type="dxa" w:w="1008"/>
-            <w:shd w:fill="EAECEE"/>
-            <w:tcMar>
-              <w:top w:w="120" w:type="dxa"/>
-              <w:bottom w:w="120" w:type="dxa"/>
-              <w:left w:w="140" w:type="dxa"/>
-              <w:right w:w="140" w:type="dxa"/>
-            </w:tcMar>
-          </w:tcPr>
-          <w:p>
-            <w:pPr>
-              <w:jc w:val="center"/>
-            </w:pPr>
-            <w:r>
-              <w:rPr>
-                <w:rFonts w:ascii="Times New Roman" w:hAnsi="Times New Roman"/>
-                <w:b/>
-                <w:sz w:val="19"/>
-              </w:rPr>
-              <w:t>Mean Tokens</w:t>
-            </w:r>
-          </w:p>
-        </w:tc>
-        <w:tc>
-          <w:tcPr>
-            <w:tcW w:type="dxa" w:w="1152"/>
-            <w:shd w:fill="EAECEE"/>
-            <w:tcMar>
-              <w:top w:w="120" w:type="dxa"/>
-              <w:bottom w:w="120" w:type="dxa"/>
-              <w:left w:w="140" w:type="dxa"/>
-              <w:right w:w="140" w:type="dxa"/>
-            </w:tcMar>
-          </w:tcPr>
-          <w:p>
-            <w:pPr>
-              <w:jc w:val="center"/>
-            </w:pPr>
-            <w:r>
-              <w:rPr>
-                <w:rFonts w:ascii="Times New Roman" w:hAnsi="Times New Roman"/>
-                <w:b/>
-                <w:sz w:val="19"/>
-              </w:rPr>
-              <w:t>Token Red. (%)</w:t>
-            </w:r>
-          </w:p>
-        </w:tc>
-        <w:tc>
-          <w:tcPr>
-            <w:tcW w:type="dxa" w:w="1152"/>
-            <w:shd w:fill="EAECEE"/>
-            <w:tcMar>
-              <w:top w:w="120" w:type="dxa"/>
-              <w:bottom w:w="120" w:type="dxa"/>
-              <w:left w:w="140" w:type="dxa"/>
-              <w:right w:w="140" w:type="dxa"/>
-            </w:tcMar>
-          </w:tcPr>
-          <w:p>
-            <w:pPr>
-              <w:jc w:val="center"/>
-            </w:pPr>
-            <w:r>
-              <w:rPr>
-                <w:rFonts w:ascii="Times New Roman" w:hAnsi="Times New Roman"/>
-                <w:b/>
-                <w:sz w:val="19"/>
-              </w:rPr>
-              <w:t>AST Divergence</w:t>
-            </w:r>
-          </w:p>
-        </w:tc>
-        <w:tc>
-          <w:tcPr>
-            <w:tcW w:type="dxa" w:w="1152"/>
-            <w:shd w:fill="EAECEE"/>
-            <w:tcMar>
-              <w:top w:w="120" w:type="dxa"/>
-              <w:bottom w:w="120" w:type="dxa"/>
-              <w:left w:w="140" w:type="dxa"/>
-              <w:right w:w="140" w:type="dxa"/>
-            </w:tcMar>
-          </w:tcPr>
-          <w:p>
-            <w:pPr>
-              <w:jc w:val="center"/>
-            </w:pPr>
-            <w:r>
-              <w:rPr>
-                <w:rFonts w:ascii="Times New Roman" w:hAnsi="Times New Roman"/>
-                <w:b/>
-                <w:sz w:val="19"/>
-              </w:rPr>
-              <w:t>Invariant Ret. (%)</w:t>
-            </w:r>
-          </w:p>
-        </w:tc>
-        <w:tc>
-          <w:tcPr>
-            <w:tcW w:type="dxa" w:w="1008"/>
-            <w:shd w:fill="EAECEE"/>
-            <w:tcMar>
-              <w:top w:w="120" w:type="dxa"/>
-              <w:bottom w:w="120" w:type="dxa"/>
-              <w:left w:w="140" w:type="dxa"/>
-              <w:right w:w="140" w:type="dxa"/>
-            </w:tcMar>
-          </w:tcPr>
-          <w:p>
-            <w:pPr>
-              <w:jc w:val="center"/>
-            </w:pPr>
-            <w:r>
-              <w:rPr>
-                <w:rFonts w:ascii="Times New Roman" w:hAnsi="Times New Roman"/>
-                <w:b/>
-                <w:sz w:val="19"/>
-              </w:rPr>
-              <w:t>Syntax Pass (%)</w:t>
-            </w:r>
-          </w:p>
-        </w:tc>
-        <w:tc>
-          <w:tcPr>
-            <w:tcW w:type="dxa" w:w="2016"/>
-            <w:shd w:fill="EAECEE"/>
-            <w:tcMar>
-              <w:top w:w="120" w:type="dxa"/>
-              <w:bottom w:w="120" w:type="dxa"/>
-              <w:left w:w="140" w:type="dxa"/>
-              <w:right w:w="140" w:type="dxa"/>
-            </w:tcMar>
-          </w:tcPr>
-          <w:p>
-            <w:pPr>
-              <w:jc w:val="center"/>
-            </w:pPr>
-            <w:r>
-              <w:rPr>
-                <w:rFonts w:ascii="Times New Roman" w:hAnsi="Times New Roman"/>
-                <w:b/>
-                <w:sz w:val="19"/>
-              </w:rPr>
-              <w:t>Mutual Info I(Ty; Tx | S)</w:t>
-            </w:r>
-          </w:p>
-        </w:tc>
-      </w:tr>
-      <w:tr>
-        <w:tc>
-          <w:tcPr>
-            <w:tcW w:type="dxa" w:w="2592"/>
-            <w:shd w:fill="FFFFFF"/>
-            <w:tcMar>
-              <w:top w:w="100" w:type="dxa"/>
-              <w:bottom w:w="100" w:type="dxa"/>
-              <w:left w:w="120" w:type="dxa"/>
-              <w:right w:w="120" w:type="dxa"/>
-            </w:tcMar>
-          </w:tcPr>
-          <w:p>
-            <w:pPr>
-              <w:jc w:val="left"/>
-            </w:pPr>
-            <w:r>
-              <w:rPr>
-                <w:rFonts w:ascii="Times New Roman" w:hAnsi="Times New Roman"/>
-                <w:sz w:val="18"/>
-              </w:rPr>
-              <w:t>C_D: Direct Baseline Control</w:t>
-            </w:r>
-          </w:p>
-        </w:tc>
-        <w:tc>
-          <w:tcPr>
-            <w:tcW w:type="dxa" w:w="1008"/>
-            <w:shd w:fill="FFFFFF"/>
-            <w:tcMar>
-              <w:top w:w="100" w:type="dxa"/>
-              <w:bottom w:w="100" w:type="dxa"/>
-              <w:left w:w="120" w:type="dxa"/>
-              <w:right w:w="120" w:type="dxa"/>
-            </w:tcMar>
-          </w:tcPr>
-          <w:p>
-            <w:pPr>
-              <w:jc w:val="center"/>
-            </w:pPr>
-            <w:r>
-              <w:rPr>
-                <w:rFonts w:ascii="Times New Roman" w:hAnsi="Times New Roman"/>
-                <w:sz w:val="18"/>
-              </w:rPr>
-              <w:t>2,840</w:t>
-            </w:r>
-          </w:p>
-        </w:tc>
-        <w:tc>
-          <w:tcPr>
-            <w:tcW w:type="dxa" w:w="1152"/>
-            <w:shd w:fill="FFFFFF"/>
-            <w:tcMar>
-              <w:top w:w="100" w:type="dxa"/>
-              <w:bottom w:w="100" w:type="dxa"/>
-              <w:left w:w="120" w:type="dxa"/>
-              <w:right w:w="120" w:type="dxa"/>
-            </w:tcMar>
-          </w:tcPr>
-          <w:p>
-            <w:pPr>
-              <w:jc w:val="center"/>
-            </w:pPr>
-            <w:r>
-              <w:rPr>
-                <w:rFonts w:ascii="Times New Roman" w:hAnsi="Times New Roman"/>
-                <w:sz w:val="18"/>
-              </w:rPr>
-              <w:t>0.0%</w:t>
-            </w:r>
-          </w:p>
-        </w:tc>
-        <w:tc>
-          <w:tcPr>
-            <w:tcW w:type="dxa" w:w="1152"/>
-            <w:shd w:fill="FFFFFF"/>
-            <w:tcMar>
-              <w:top w:w="100" w:type="dxa"/>
-              <w:bottom w:w="100" w:type="dxa"/>
-              <w:left w:w="120" w:type="dxa"/>
-              <w:right w:w="120" w:type="dxa"/>
-            </w:tcMar>
-          </w:tcPr>
-          <w:p>
-            <w:pPr>
-              <w:jc w:val="center"/>
-            </w:pPr>
-            <w:r>
-              <w:rPr>
-                <w:rFonts w:ascii="Times New Roman" w:hAnsi="Times New Roman"/>
-                <w:sz w:val="18"/>
-              </w:rPr>
-              <w:t>0.0197</w:t>
-            </w:r>
-          </w:p>
-        </w:tc>
-        <w:tc>
-          <w:tcPr>
-            <w:tcW w:type="dxa" w:w="1152"/>
-            <w:shd w:fill="FFFFFF"/>
-            <w:tcMar>
-              <w:top w:w="100" w:type="dxa"/>
-              <w:bottom w:w="100" w:type="dxa"/>
-              <w:left w:w="120" w:type="dxa"/>
-              <w:right w:w="120" w:type="dxa"/>
-            </w:tcMar>
-          </w:tcPr>
-          <w:p>
-            <w:pPr>
-              <w:jc w:val="center"/>
-            </w:pPr>
-            <w:r>
-              <w:rPr>
-                <w:rFonts w:ascii="Times New Roman" w:hAnsi="Times New Roman"/>
-                <w:sz w:val="18"/>
-              </w:rPr>
-              <w:t>98.5%</w:t>
-            </w:r>
-          </w:p>
-        </w:tc>
-        <w:tc>
-          <w:tcPr>
-            <w:tcW w:type="dxa" w:w="1008"/>
-            <w:shd w:fill="FFFFFF"/>
-            <w:tcMar>
-              <w:top w:w="100" w:type="dxa"/>
-              <w:bottom w:w="100" w:type="dxa"/>
-              <w:left w:w="120" w:type="dxa"/>
-              <w:right w:w="120" w:type="dxa"/>
-            </w:tcMar>
-          </w:tcPr>
-          <w:p>
-            <w:pPr>
-              <w:jc w:val="center"/>
-            </w:pPr>
-            <w:r>
-              <w:rPr>
-                <w:rFonts w:ascii="Times New Roman" w:hAnsi="Times New Roman"/>
-                <w:sz w:val="18"/>
-              </w:rPr>
-              <w:t>96.0%</w:t>
-            </w:r>
-          </w:p>
-        </w:tc>
-        <w:tc>
-          <w:tcPr>
-            <w:tcW w:type="dxa" w:w="2016"/>
-            <w:shd w:fill="FFFFFF"/>
-            <w:tcMar>
-              <w:top w:w="100" w:type="dxa"/>
-              <w:bottom w:w="100" w:type="dxa"/>
-              <w:left w:w="120" w:type="dxa"/>
-              <w:right w:w="120" w:type="dxa"/>
-            </w:tcMar>
-          </w:tcPr>
-          <w:p>
-            <w:pPr>
-              <w:jc w:val="center"/>
-            </w:pPr>
-            <w:r>
-              <w:rPr>
-                <w:rFonts w:ascii="Times New Roman" w:hAnsi="Times New Roman"/>
-                <w:sz w:val="18"/>
-              </w:rPr>
-              <w:t>1.0000 (Anchored)</w:t>
-            </w:r>
-          </w:p>
-        </w:tc>
-      </w:tr>
-      <w:tr>
-        <w:tc>
-          <w:tcPr>
-            <w:tcW w:type="dxa" w:w="2592"/>
-            <w:shd w:fill="F8F9F9"/>
-            <w:tcMar>
-              <w:top w:w="100" w:type="dxa"/>
-              <w:bottom w:w="100" w:type="dxa"/>
-              <w:left w:w="120" w:type="dxa"/>
-              <w:right w:w="120" w:type="dxa"/>
-            </w:tcMar>
-          </w:tcPr>
-          <w:p>
-            <w:pPr>
-              <w:jc w:val="left"/>
-            </w:pPr>
-            <w:r>
-              <w:rPr>
-                <w:rFonts w:ascii="Times New Roman" w:hAnsi="Times New Roman"/>
-                <w:sz w:val="18"/>
-              </w:rPr>
-              <w:t>C_Trunc: 50% Token Truncation</w:t>
-            </w:r>
-          </w:p>
-        </w:tc>
-        <w:tc>
-          <w:tcPr>
-            <w:tcW w:type="dxa" w:w="1008"/>
-            <w:shd w:fill="F8F9F9"/>
-            <w:tcMar>
-              <w:top w:w="100" w:type="dxa"/>
-              <w:bottom w:w="100" w:type="dxa"/>
-              <w:left w:w="120" w:type="dxa"/>
-              <w:right w:w="120" w:type="dxa"/>
-            </w:tcMar>
-          </w:tcPr>
-          <w:p>
-            <w:pPr>
-              <w:jc w:val="center"/>
-            </w:pPr>
-            <w:r>
-              <w:rPr>
-                <w:rFonts w:ascii="Times New Roman" w:hAnsi="Times New Roman"/>
-                <w:sz w:val="18"/>
-              </w:rPr>
-              <w:t>1,420</w:t>
-            </w:r>
-          </w:p>
-        </w:tc>
-        <w:tc>
-          <w:tcPr>
-            <w:tcW w:type="dxa" w:w="1152"/>
-            <w:shd w:fill="F8F9F9"/>
-            <w:tcMar>
-              <w:top w:w="100" w:type="dxa"/>
-              <w:bottom w:w="100" w:type="dxa"/>
-              <w:left w:w="120" w:type="dxa"/>
-              <w:right w:w="120" w:type="dxa"/>
-            </w:tcMar>
-          </w:tcPr>
-          <w:p>
-            <w:pPr>
-              <w:jc w:val="center"/>
-            </w:pPr>
-            <w:r>
-              <w:rPr>
-                <w:rFonts w:ascii="Times New Roman" w:hAnsi="Times New Roman"/>
-                <w:sz w:val="18"/>
-              </w:rPr>
-              <w:t>50.0%</w:t>
-            </w:r>
-          </w:p>
-        </w:tc>
-        <w:tc>
-          <w:tcPr>
-            <w:tcW w:type="dxa" w:w="1152"/>
-            <w:shd w:fill="F8F9F9"/>
-            <w:tcMar>
-              <w:top w:w="100" w:type="dxa"/>
-              <w:bottom w:w="100" w:type="dxa"/>
-              <w:left w:w="120" w:type="dxa"/>
-              <w:right w:w="120" w:type="dxa"/>
-            </w:tcMar>
-          </w:tcPr>
-          <w:p>
-            <w:pPr>
-              <w:jc w:val="center"/>
-            </w:pPr>
-            <w:r>
-              <w:rPr>
-                <w:rFonts w:ascii="Times New Roman" w:hAnsi="Times New Roman"/>
-                <w:sz w:val="18"/>
-              </w:rPr>
-              <w:t>0.0842</w:t>
-            </w:r>
-          </w:p>
-        </w:tc>
-        <w:tc>
-          <w:tcPr>
-            <w:tcW w:type="dxa" w:w="1152"/>
-            <w:shd w:fill="F8F9F9"/>
-            <w:tcMar>
-              <w:top w:w="100" w:type="dxa"/>
-              <w:bottom w:w="100" w:type="dxa"/>
-              <w:left w:w="120" w:type="dxa"/>
-              <w:right w:w="120" w:type="dxa"/>
-            </w:tcMar>
-          </w:tcPr>
-          <w:p>
-            <w:pPr>
-              <w:jc w:val="center"/>
-            </w:pPr>
-            <w:r>
-              <w:rPr>
-                <w:rFonts w:ascii="Times New Roman" w:hAnsi="Times New Roman"/>
-                <w:sz w:val="18"/>
-              </w:rPr>
-              <w:t>48.0%</w:t>
-            </w:r>
-          </w:p>
-        </w:tc>
-        <w:tc>
-          <w:tcPr>
-            <w:tcW w:type="dxa" w:w="1008"/>
-            <w:shd w:fill="F8F9F9"/>
-            <w:tcMar>
-              <w:top w:w="100" w:type="dxa"/>
-              <w:bottom w:w="100" w:type="dxa"/>
-              <w:left w:w="120" w:type="dxa"/>
-              <w:right w:w="120" w:type="dxa"/>
-            </w:tcMar>
-          </w:tcPr>
-          <w:p>
-            <w:pPr>
-              <w:jc w:val="center"/>
-            </w:pPr>
-            <w:r>
-              <w:rPr>
-                <w:rFonts w:ascii="Times New Roman" w:hAnsi="Times New Roman"/>
-                <w:sz w:val="18"/>
-              </w:rPr>
-              <w:t>54.0%</w:t>
-            </w:r>
-          </w:p>
-        </w:tc>
-        <w:tc>
-          <w:tcPr>
-            <w:tcW w:type="dxa" w:w="2016"/>
-            <w:shd w:fill="F8F9F9"/>
-            <w:tcMar>
-              <w:top w:w="100" w:type="dxa"/>
-              <w:bottom w:w="100" w:type="dxa"/>
-              <w:left w:w="120" w:type="dxa"/>
-              <w:right w:w="120" w:type="dxa"/>
-            </w:tcMar>
-          </w:tcPr>
-          <w:p>
-            <w:pPr>
-              <w:jc w:val="center"/>
-            </w:pPr>
-            <w:r>
-              <w:rPr>
-                <w:rFonts w:ascii="Times New Roman" w:hAnsi="Times New Roman"/>
-                <w:sz w:val="18"/>
-              </w:rPr>
-              <w:t>0.7850 (Partial)</w:t>
-            </w:r>
-          </w:p>
-        </w:tc>
-      </w:tr>
-      <w:tr>
-        <w:tc>
-          <w:tcPr>
-            <w:tcW w:type="dxa" w:w="2592"/>
-            <w:shd w:fill="FFFFFF"/>
-            <w:tcMar>
-              <w:top w:w="100" w:type="dxa"/>
-              <w:bottom w:w="100" w:type="dxa"/>
-              <w:left w:w="120" w:type="dxa"/>
-              <w:right w:w="120" w:type="dxa"/>
-            </w:tcMar>
-          </w:tcPr>
-          <w:p>
-            <w:pPr>
-              <w:jc w:val="left"/>
-            </w:pPr>
-            <w:r>
-              <w:rPr>
-                <w:rFonts w:ascii="Times New Roman" w:hAnsi="Times New Roman"/>
-                <w:sz w:val="18"/>
-              </w:rPr>
-              <w:t>C_Skel: Structural AST Skeleton</w:t>
-            </w:r>
-          </w:p>
-        </w:tc>
-        <w:tc>
-          <w:tcPr>
-            <w:tcW w:type="dxa" w:w="1008"/>
-            <w:shd w:fill="FFFFFF"/>
-            <w:tcMar>
-              <w:top w:w="100" w:type="dxa"/>
-              <w:bottom w:w="100" w:type="dxa"/>
-              <w:left w:w="120" w:type="dxa"/>
-              <w:right w:w="120" w:type="dxa"/>
-            </w:tcMar>
-          </w:tcPr>
-          <w:p>
-            <w:pPr>
-              <w:jc w:val="center"/>
-            </w:pPr>
-            <w:r>
-              <w:rPr>
-                <w:rFonts w:ascii="Times New Roman" w:hAnsi="Times New Roman"/>
-                <w:sz w:val="18"/>
-              </w:rPr>
-              <w:t>960</w:t>
-            </w:r>
-          </w:p>
-        </w:tc>
-        <w:tc>
-          <w:tcPr>
-            <w:tcW w:type="dxa" w:w="1152"/>
-            <w:shd w:fill="FFFFFF"/>
-            <w:tcMar>
-              <w:top w:w="100" w:type="dxa"/>
-              <w:bottom w:w="100" w:type="dxa"/>
-              <w:left w:w="120" w:type="dxa"/>
-              <w:right w:w="120" w:type="dxa"/>
-            </w:tcMar>
-          </w:tcPr>
-          <w:p>
-            <w:pPr>
-              <w:jc w:val="center"/>
-            </w:pPr>
-            <w:r>
-              <w:rPr>
-                <w:rFonts w:ascii="Times New Roman" w:hAnsi="Times New Roman"/>
-                <w:sz w:val="18"/>
-              </w:rPr>
-              <w:t>66.2%</w:t>
-            </w:r>
-          </w:p>
-        </w:tc>
-        <w:tc>
-          <w:tcPr>
-            <w:tcW w:type="dxa" w:w="1152"/>
-            <w:shd w:fill="FFFFFF"/>
-            <w:tcMar>
-              <w:top w:w="100" w:type="dxa"/>
-              <w:bottom w:w="100" w:type="dxa"/>
-              <w:left w:w="120" w:type="dxa"/>
-              <w:right w:w="120" w:type="dxa"/>
-            </w:tcMar>
-          </w:tcPr>
-          <w:p>
-            <w:pPr>
-              <w:jc w:val="center"/>
-            </w:pPr>
-            <w:r>
-              <w:rPr>
-                <w:rFonts w:ascii="Times New Roman" w:hAnsi="Times New Roman"/>
-                <w:sz w:val="18"/>
-              </w:rPr>
-              <w:t>0.1415</w:t>
-            </w:r>
-          </w:p>
-        </w:tc>
-        <w:tc>
-          <w:tcPr>
-            <w:tcW w:type="dxa" w:w="1152"/>
-            <w:shd w:fill="FFFFFF"/>
-            <w:tcMar>
-              <w:top w:w="100" w:type="dxa"/>
-              <w:bottom w:w="100" w:type="dxa"/>
-              <w:left w:w="120" w:type="dxa"/>
-              <w:right w:w="120" w:type="dxa"/>
-            </w:tcMar>
-          </w:tcPr>
-          <w:p>
-            <w:pPr>
-              <w:jc w:val="center"/>
-            </w:pPr>
-            <w:r>
-              <w:rPr>
-                <w:rFonts w:ascii="Times New Roman" w:hAnsi="Times New Roman"/>
-                <w:sz w:val="18"/>
-              </w:rPr>
-              <w:t>52.0%</w:t>
-            </w:r>
-          </w:p>
-        </w:tc>
-        <w:tc>
-          <w:tcPr>
-            <w:tcW w:type="dxa" w:w="1008"/>
-            <w:shd w:fill="FFFFFF"/>
-            <w:tcMar>
-              <w:top w:w="100" w:type="dxa"/>
-              <w:bottom w:w="100" w:type="dxa"/>
-              <w:left w:w="120" w:type="dxa"/>
-              <w:right w:w="120" w:type="dxa"/>
-            </w:tcMar>
-          </w:tcPr>
-          <w:p>
-            <w:pPr>
-              <w:jc w:val="center"/>
-            </w:pPr>
-            <w:r>
-              <w:rPr>
-                <w:rFonts w:ascii="Times New Roman" w:hAnsi="Times New Roman"/>
-                <w:sz w:val="18"/>
-              </w:rPr>
-              <w:t>88.0%</w:t>
-            </w:r>
-          </w:p>
-        </w:tc>
-        <w:tc>
-          <w:tcPr>
-            <w:tcW w:type="dxa" w:w="2016"/>
-            <w:shd w:fill="FFFFFF"/>
-            <w:tcMar>
-              <w:top w:w="100" w:type="dxa"/>
-              <w:bottom w:w="100" w:type="dxa"/>
-              <w:left w:w="120" w:type="dxa"/>
-              <w:right w:w="120" w:type="dxa"/>
-            </w:tcMar>
-          </w:tcPr>
-          <w:p>
-            <w:pPr>
-              <w:jc w:val="center"/>
-            </w:pPr>
-            <w:r>
-              <w:rPr>
-                <w:rFonts w:ascii="Times New Roman" w:hAnsi="Times New Roman"/>
-                <w:sz w:val="18"/>
-              </w:rPr>
-              <w:t>0.8920 (Structural)</w:t>
-            </w:r>
-          </w:p>
-        </w:tc>
-      </w:tr>
-      <w:tr>
-        <w:tc>
-          <w:tcPr>
-            <w:tcW w:type="dxa" w:w="2592"/>
-            <w:shd w:fill="F8F9F9"/>
-            <w:tcMar>
-              <w:top w:w="100" w:type="dxa"/>
-              <w:bottom w:w="100" w:type="dxa"/>
-              <w:left w:w="120" w:type="dxa"/>
-              <w:right w:w="120" w:type="dxa"/>
-            </w:tcMar>
-          </w:tcPr>
-          <w:p>
-            <w:pPr>
-              <w:jc w:val="left"/>
-            </w:pPr>
-            <w:r>
-              <w:rPr>
-                <w:rFonts w:ascii="Times New Roman" w:hAnsi="Times New Roman"/>
-                <w:sz w:val="18"/>
-              </w:rPr>
-              <w:t>C_Doc: Natural Language Prose Spec</w:t>
-            </w:r>
-          </w:p>
-        </w:tc>
-        <w:tc>
-          <w:tcPr>
-            <w:tcW w:type="dxa" w:w="1008"/>
-            <w:shd w:fill="F8F9F9"/>
-            <w:tcMar>
-              <w:top w:w="100" w:type="dxa"/>
-              <w:bottom w:w="100" w:type="dxa"/>
-              <w:left w:w="120" w:type="dxa"/>
-              <w:right w:w="120" w:type="dxa"/>
-            </w:tcMar>
-          </w:tcPr>
-          <w:p>
-            <w:pPr>
-              <w:jc w:val="center"/>
-            </w:pPr>
-            <w:r>
-              <w:rPr>
-                <w:rFonts w:ascii="Times New Roman" w:hAnsi="Times New Roman"/>
-                <w:sz w:val="18"/>
-              </w:rPr>
-              <w:t>420</w:t>
-            </w:r>
-          </w:p>
-        </w:tc>
-        <w:tc>
-          <w:tcPr>
-            <w:tcW w:type="dxa" w:w="1152"/>
-            <w:shd w:fill="F8F9F9"/>
-            <w:tcMar>
-              <w:top w:w="100" w:type="dxa"/>
-              <w:bottom w:w="100" w:type="dxa"/>
-              <w:left w:w="120" w:type="dxa"/>
-              <w:right w:w="120" w:type="dxa"/>
-            </w:tcMar>
-          </w:tcPr>
-          <w:p>
-            <w:pPr>
-              <w:jc w:val="center"/>
-            </w:pPr>
-            <w:r>
-              <w:rPr>
-                <w:rFonts w:ascii="Times New Roman" w:hAnsi="Times New Roman"/>
-                <w:sz w:val="18"/>
-              </w:rPr>
-              <w:t>85.2%</w:t>
-            </w:r>
-          </w:p>
-        </w:tc>
-        <w:tc>
-          <w:tcPr>
-            <w:tcW w:type="dxa" w:w="1152"/>
-            <w:shd w:fill="F8F9F9"/>
-            <w:tcMar>
-              <w:top w:w="100" w:type="dxa"/>
-              <w:bottom w:w="100" w:type="dxa"/>
-              <w:left w:w="120" w:type="dxa"/>
-              <w:right w:w="120" w:type="dxa"/>
-            </w:tcMar>
-          </w:tcPr>
-          <w:p>
-            <w:pPr>
-              <w:jc w:val="center"/>
-            </w:pPr>
-            <w:r>
-              <w:rPr>
-                <w:rFonts w:ascii="Times New Roman" w:hAnsi="Times New Roman"/>
-                <w:sz w:val="18"/>
-              </w:rPr>
-              <w:t>0.9180</w:t>
-            </w:r>
-          </w:p>
-        </w:tc>
-        <w:tc>
-          <w:tcPr>
-            <w:tcW w:type="dxa" w:w="1152"/>
-            <w:shd w:fill="F8F9F9"/>
-            <w:tcMar>
-              <w:top w:w="100" w:type="dxa"/>
-              <w:bottom w:w="100" w:type="dxa"/>
-              <w:left w:w="120" w:type="dxa"/>
-              <w:right w:w="120" w:type="dxa"/>
-            </w:tcMar>
-          </w:tcPr>
-          <w:p>
-            <w:pPr>
-              <w:jc w:val="center"/>
-            </w:pPr>
-            <w:r>
-              <w:rPr>
-                <w:rFonts w:ascii="Times New Roman" w:hAnsi="Times New Roman"/>
-                <w:sz w:val="18"/>
-              </w:rPr>
-              <w:t>74.5%</w:t>
-            </w:r>
-          </w:p>
-        </w:tc>
-        <w:tc>
-          <w:tcPr>
-            <w:tcW w:type="dxa" w:w="1008"/>
-            <w:shd w:fill="F8F9F9"/>
-            <w:tcMar>
-              <w:top w:w="100" w:type="dxa"/>
-              <w:bottom w:w="100" w:type="dxa"/>
-              <w:left w:w="120" w:type="dxa"/>
-              <w:right w:w="120" w:type="dxa"/>
-            </w:tcMar>
-          </w:tcPr>
-          <w:p>
-            <w:pPr>
-              <w:jc w:val="center"/>
-            </w:pPr>
-            <w:r>
-              <w:rPr>
-                <w:rFonts w:ascii="Times New Roman" w:hAnsi="Times New Roman"/>
-                <w:sz w:val="18"/>
-              </w:rPr>
-              <w:t>92.0%</w:t>
-            </w:r>
-          </w:p>
-        </w:tc>
-        <w:tc>
-          <w:tcPr>
-            <w:tcW w:type="dxa" w:w="2016"/>
-            <w:shd w:fill="F8F9F9"/>
-            <w:tcMar>
-              <w:top w:w="100" w:type="dxa"/>
-              <w:bottom w:w="100" w:type="dxa"/>
-              <w:left w:w="120" w:type="dxa"/>
-              <w:right w:w="120" w:type="dxa"/>
-            </w:tcMar>
-          </w:tcPr>
-          <w:p>
-            <w:pPr>
-              <w:jc w:val="center"/>
-            </w:pPr>
-            <w:r>
-              <w:rPr>
-                <w:rFonts w:ascii="Times New Roman" w:hAnsi="Times New Roman"/>
-                <w:sz w:val="18"/>
-              </w:rPr>
-              <w:t>0.0000 (Ambiguous)</w:t>
-            </w:r>
-          </w:p>
-        </w:tc>
-      </w:tr>
-      <w:tr>
-        <w:tc>
-          <w:tcPr>
-            <w:tcW w:type="dxa" w:w="2592"/>
-            <w:shd w:fill="FFFFFF"/>
-            <w:tcMar>
-              <w:top w:w="100" w:type="dxa"/>
-              <w:bottom w:w="100" w:type="dxa"/>
-              <w:left w:w="120" w:type="dxa"/>
-              <w:right w:w="120" w:type="dxa"/>
-            </w:tcMar>
-          </w:tcPr>
-          <w:p>
-            <w:pPr>
-              <w:jc w:val="left"/>
-            </w:pPr>
-            <w:r>
-              <w:rPr>
-                <w:rFonts w:ascii="Times New Roman" w:hAnsi="Times New Roman"/>
-                <w:sz w:val="18"/>
-              </w:rPr>
-              <w:t>C_JSON: Strict JSON Schema</w:t>
-            </w:r>
-          </w:p>
-        </w:tc>
-        <w:tc>
-          <w:tcPr>
-            <w:tcW w:type="dxa" w:w="1008"/>
-            <w:shd w:fill="FFFFFF"/>
-            <w:tcMar>
-              <w:top w:w="100" w:type="dxa"/>
-              <w:bottom w:w="100" w:type="dxa"/>
-              <w:left w:w="120" w:type="dxa"/>
-              <w:right w:w="120" w:type="dxa"/>
-            </w:tcMar>
-          </w:tcPr>
-          <w:p>
-            <w:pPr>
-              <w:jc w:val="center"/>
-            </w:pPr>
-            <w:r>
-              <w:rPr>
-                <w:rFonts w:ascii="Times New Roman" w:hAnsi="Times New Roman"/>
-                <w:sz w:val="18"/>
-              </w:rPr>
-              <w:t>510</w:t>
-            </w:r>
-          </w:p>
-        </w:tc>
-        <w:tc>
-          <w:tcPr>
-            <w:tcW w:type="dxa" w:w="1152"/>
-            <w:shd w:fill="FFFFFF"/>
-            <w:tcMar>
-              <w:top w:w="100" w:type="dxa"/>
-              <w:bottom w:w="100" w:type="dxa"/>
-              <w:left w:w="120" w:type="dxa"/>
-              <w:right w:w="120" w:type="dxa"/>
-            </w:tcMar>
-          </w:tcPr>
-          <w:p>
-            <w:pPr>
-              <w:jc w:val="center"/>
-            </w:pPr>
-            <w:r>
-              <w:rPr>
-                <w:rFonts w:ascii="Times New Roman" w:hAnsi="Times New Roman"/>
-                <w:sz w:val="18"/>
-              </w:rPr>
-              <w:t>82.0%</w:t>
-            </w:r>
-          </w:p>
-        </w:tc>
-        <w:tc>
-          <w:tcPr>
-            <w:tcW w:type="dxa" w:w="1152"/>
-            <w:shd w:fill="FFFFFF"/>
-            <w:tcMar>
-              <w:top w:w="100" w:type="dxa"/>
-              <w:bottom w:w="100" w:type="dxa"/>
-              <w:left w:w="120" w:type="dxa"/>
-              <w:right w:w="120" w:type="dxa"/>
-            </w:tcMar>
-          </w:tcPr>
-          <w:p>
-            <w:pPr>
-              <w:jc w:val="center"/>
-            </w:pPr>
-            <w:r>
-              <w:rPr>
-                <w:rFonts w:ascii="Times New Roman" w:hAnsi="Times New Roman"/>
-                <w:sz w:val="18"/>
-              </w:rPr>
-              <w:t>0.9840</w:t>
-            </w:r>
-          </w:p>
-        </w:tc>
-        <w:tc>
-          <w:tcPr>
-            <w:tcW w:type="dxa" w:w="1152"/>
-            <w:shd w:fill="FFFFFF"/>
-            <w:tcMar>
-              <w:top w:w="100" w:type="dxa"/>
-              <w:bottom w:w="100" w:type="dxa"/>
-              <w:left w:w="120" w:type="dxa"/>
-              <w:right w:w="120" w:type="dxa"/>
-            </w:tcMar>
-          </w:tcPr>
-          <w:p>
-            <w:pPr>
-              <w:jc w:val="center"/>
-            </w:pPr>
-            <w:r>
-              <w:rPr>
-                <w:rFonts w:ascii="Times New Roman" w:hAnsi="Times New Roman"/>
-                <w:sz w:val="18"/>
-              </w:rPr>
-              <w:t>96.0%</w:t>
-            </w:r>
-          </w:p>
-        </w:tc>
-        <w:tc>
-          <w:tcPr>
-            <w:tcW w:type="dxa" w:w="1008"/>
-            <w:shd w:fill="FFFFFF"/>
-            <w:tcMar>
-              <w:top w:w="100" w:type="dxa"/>
-              <w:bottom w:w="100" w:type="dxa"/>
-              <w:left w:w="120" w:type="dxa"/>
-              <w:right w:w="120" w:type="dxa"/>
-            </w:tcMar>
-          </w:tcPr>
-          <w:p>
-            <w:pPr>
-              <w:jc w:val="center"/>
-            </w:pPr>
-            <w:r>
-              <w:rPr>
-                <w:rFonts w:ascii="Times New Roman" w:hAnsi="Times New Roman"/>
-                <w:sz w:val="18"/>
-              </w:rPr>
-              <w:t>98.0%</w:t>
-            </w:r>
-          </w:p>
-        </w:tc>
-        <w:tc>
-          <w:tcPr>
-            <w:tcW w:type="dxa" w:w="2016"/>
-            <w:shd w:fill="FFFFFF"/>
-            <w:tcMar>
-              <w:top w:w="100" w:type="dxa"/>
-              <w:bottom w:w="100" w:type="dxa"/>
-              <w:left w:w="120" w:type="dxa"/>
-              <w:right w:w="120" w:type="dxa"/>
-            </w:tcMar>
-          </w:tcPr>
-          <w:p>
-            <w:pPr>
-              <w:jc w:val="center"/>
-            </w:pPr>
-            <w:r>
-              <w:rPr>
-                <w:rFonts w:ascii="Times New Roman" w:hAnsi="Times New Roman"/>
-                <w:sz w:val="18"/>
-              </w:rPr>
-              <w:t>0.0000 (Verbose)</w:t>
-            </w:r>
-          </w:p>
-        </w:tc>
-      </w:tr>
-      <w:tr>
-        <w:tc>
-          <w:tcPr>
-            <w:tcW w:type="dxa" w:w="2592"/>
-            <w:shd w:fill="F8F9F9"/>
-            <w:tcMar>
-              <w:top w:w="100" w:type="dxa"/>
-              <w:bottom w:w="100" w:type="dxa"/>
-              <w:left w:w="120" w:type="dxa"/>
-              <w:right w:w="120" w:type="dxa"/>
-            </w:tcMar>
-          </w:tcPr>
-          <w:p>
-            <w:pPr>
-              <w:jc w:val="left"/>
-            </w:pPr>
-            <w:r>
-              <w:rPr>
-                <w:rFonts w:ascii="Times New Roman" w:hAnsi="Times New Roman"/>
-                <w:sz w:val="18"/>
-              </w:rPr>
-              <w:t>C_YAML: Canonical Deanchor YAML</w:t>
-            </w:r>
-          </w:p>
-        </w:tc>
-        <w:tc>
-          <w:tcPr>
-            <w:tcW w:type="dxa" w:w="1008"/>
-            <w:shd w:fill="F8F9F9"/>
-            <w:tcMar>
-              <w:top w:w="100" w:type="dxa"/>
-              <w:bottom w:w="100" w:type="dxa"/>
-              <w:left w:w="120" w:type="dxa"/>
-              <w:right w:w="120" w:type="dxa"/>
-            </w:tcMar>
-          </w:tcPr>
-          <w:p>
-            <w:pPr>
-              <w:jc w:val="center"/>
-            </w:pPr>
-            <w:r>
-              <w:rPr>
-                <w:rFonts w:ascii="Times New Roman" w:hAnsi="Times New Roman"/>
-                <w:b/>
-                <w:sz w:val="18"/>
-              </w:rPr>
-              <w:t>345</w:t>
-            </w:r>
-          </w:p>
-        </w:tc>
-        <w:tc>
-          <w:tcPr>
-            <w:tcW w:type="dxa" w:w="1152"/>
-            <w:shd w:fill="F8F9F9"/>
-            <w:tcMar>
-              <w:top w:w="100" w:type="dxa"/>
-              <w:bottom w:w="100" w:type="dxa"/>
-              <w:left w:w="120" w:type="dxa"/>
-              <w:right w:w="120" w:type="dxa"/>
-            </w:tcMar>
-          </w:tcPr>
-          <w:p>
-            <w:pPr>
-              <w:jc w:val="center"/>
-            </w:pPr>
-            <w:r>
-              <w:rPr>
-                <w:rFonts w:ascii="Times New Roman" w:hAnsi="Times New Roman"/>
-                <w:b/>
-                <w:sz w:val="18"/>
-              </w:rPr>
-              <w:t>87.9%</w:t>
-            </w:r>
-          </w:p>
-        </w:tc>
-        <w:tc>
-          <w:tcPr>
-            <w:tcW w:type="dxa" w:w="1152"/>
-            <w:shd w:fill="F8F9F9"/>
-            <w:tcMar>
-              <w:top w:w="100" w:type="dxa"/>
-              <w:bottom w:w="100" w:type="dxa"/>
-              <w:left w:w="120" w:type="dxa"/>
-              <w:right w:w="120" w:type="dxa"/>
-            </w:tcMar>
-          </w:tcPr>
-          <w:p>
-            <w:pPr>
-              <w:jc w:val="center"/>
-            </w:pPr>
-            <w:r>
-              <w:rPr>
-                <w:rFonts w:ascii="Times New Roman" w:hAnsi="Times New Roman"/>
-                <w:b/>
-                <w:sz w:val="18"/>
-              </w:rPr>
-              <w:t>1.0000</w:t>
-            </w:r>
-          </w:p>
-        </w:tc>
-        <w:tc>
-          <w:tcPr>
-            <w:tcW w:type="dxa" w:w="1152"/>
-            <w:shd w:fill="F8F9F9"/>
-            <w:tcMar>
-              <w:top w:w="100" w:type="dxa"/>
-              <w:bottom w:w="100" w:type="dxa"/>
-              <w:left w:w="120" w:type="dxa"/>
-              <w:right w:w="120" w:type="dxa"/>
-            </w:tcMar>
-          </w:tcPr>
-          <w:p>
-            <w:pPr>
-              <w:jc w:val="center"/>
-            </w:pPr>
-            <w:r>
-              <w:rPr>
-                <w:rFonts w:ascii="Times New Roman" w:hAnsi="Times New Roman"/>
-                <w:b/>
-                <w:sz w:val="18"/>
-              </w:rPr>
-              <w:t>99.2%</w:t>
-            </w:r>
-          </w:p>
-        </w:tc>
-        <w:tc>
-          <w:tcPr>
-            <w:tcW w:type="dxa" w:w="1008"/>
-            <w:shd w:fill="F8F9F9"/>
-            <w:tcMar>
-              <w:top w:w="100" w:type="dxa"/>
-              <w:bottom w:w="100" w:type="dxa"/>
-              <w:left w:w="120" w:type="dxa"/>
-              <w:right w:w="120" w:type="dxa"/>
-            </w:tcMar>
-          </w:tcPr>
-          <w:p>
-            <w:pPr>
-              <w:jc w:val="center"/>
-            </w:pPr>
-            <w:r>
-              <w:rPr>
-                <w:rFonts w:ascii="Times New Roman" w:hAnsi="Times New Roman"/>
-                <w:b/>
-                <w:sz w:val="18"/>
-              </w:rPr>
-              <w:t>100.0%</w:t>
-            </w:r>
-          </w:p>
-        </w:tc>
-        <w:tc>
-          <w:tcPr>
-            <w:tcW w:type="dxa" w:w="2016"/>
-            <w:shd w:fill="F8F9F9"/>
-            <w:tcMar>
-              <w:top w:w="100" w:type="dxa"/>
-              <w:bottom w:w="100" w:type="dxa"/>
-              <w:left w:w="120" w:type="dxa"/>
-              <w:right w:w="120" w:type="dxa"/>
-            </w:tcMar>
-          </w:tcPr>
-          <w:p>
-            <w:pPr>
-              <w:jc w:val="center"/>
-            </w:pPr>
-            <w:r>
-              <w:rPr>
-                <w:rFonts w:ascii="Times New Roman" w:hAnsi="Times New Roman"/>
-                <w:b/>
-                <w:sz w:val="18"/>
-              </w:rPr>
-              <w:t>0.0000 (Optimal)</w:t>
-            </w:r>
-          </w:p>
-        </w:tc>
-      </w:tr>
-    </w:tbl>
-    <w:p>
-      <w:pPr>
-        <w:spacing w:before="80" w:after="160"/>
-      </w:pPr>
-    </w:p>
-    <w:p>
-      <w:pPr>
-        <w:spacing w:before="160" w:after="80"/>
-        <w:jc w:val="center"/>
-      </w:pPr>
-      <w:r>
-        <w:drawing>
-          <wp:inline xmlns:a="http://schemas.openxmlformats.org/drawingml/2006/main" xmlns:pic="http://schemas.openxmlformats.org/drawingml/2006/picture">
-            <wp:extent cx="5669280" cy="2239402"/>
-            <wp:docPr id="5" name="Picture 5"/>
-            <wp:cNvGraphicFramePr>
-              <a:graphicFrameLocks noChangeAspect="1"/>
-            </wp:cNvGraphicFramePr>
-            <a:graphic>
-              <a:graphicData uri="http://schemas.openxmlformats.org/drawingml/2006/picture">
-                <pic:pic>
-                  <pic:nvPicPr>
-                    <pic:cNvPr id="0" name="fig6_ablation_study.png"/>
-                    <pic:cNvPicPr/>
-                  </pic:nvPicPr>
-                  <pic:blipFill>
-                    <a:blip r:embed="rId13"/>
-                    <a:stretch>
-                      <a:fillRect/>
-                    </a:stretch>
-                  </pic:blipFill>
-                  <pic:spPr>
-                    <a:xfrm>
-                      <a:off x="0" y="0"/>
-                      <a:ext cx="5669280" cy="2239402"/>
-                    </a:xfrm>
-                    <a:prstGeom prst="rect"/>
-                  </pic:spPr>
-                </pic:pic>
-              </a:graphicData>
-            </a:graphic>
-          </wp:inline>
-        </w:drawing>
-      </w:r>
-    </w:p>
-    <w:p>
-      <w:pPr>
-        <w:spacing w:before="40" w:after="200"/>
-        <w:jc w:val="center"/>
-      </w:pPr>
-      <w:r>
-        <w:rPr>
-          <w:rFonts w:ascii="Times New Roman" w:hAnsi="Times New Roman"/>
-          <w:i/>
-          <w:sz w:val="18"/>
-        </w:rPr>
-        <w:t>Figure 6: Multi-metric ablation analysis comparing conditioning representations across structural divergence, invariant retention, prompt footprint, and syntax validity.</w:t>
       </w:r>
     </w:p>
     <w:p>
@@ -5770,7 +5161,7 @@
           <w:rFonts w:ascii="Times New Roman" w:hAnsi="Times New Roman"/>
           <w:sz w:val="20"/>
         </w:rPr>
-        <w:t>Our experimental results reveal three key findings: (1) The Context Window Inflation Paradox: Large context window capacities (up to 1,000,000 tokens in Nemotron 550B) do not alleviate Contextual Anchoring Bias; rather, they exacerbate it. Under standard prompting, the presence of legacy code scales the key-value cache size, saturating self-attention channels and keeping generated token values trapped in local topological states. (2) Decoupled Performance Invariance: When the Markov chain X -&gt; S -&gt; Y is enforced via Two-Stage Decoupling, local edge models (e.g., Google Gemma 2 9B IT, Qwen 2.5 Coder 30B) and remote cloud flagships (e.g., Nemotron 550B Ultra) both achieve near-perfect structural divergence (0.9400 ± 0.0514 AST divergence on local edge benchmarks; up to 1.0000 on flagship runs). This proves that the decoupling protocol is scale-invariant. (3) Token Noise Compression Limits: As repository sizes increase (beyond 1,000 LOC), the Stage 1 YAML contractor filters out between 40.3% and 94.4% of layout tokens. This maximizes the downstream model's attention resource budget, leading to cleaner syntax structures and preventing attention sink traps.</w:t>
+        <w:t>Our experimental results reveal three key findings: (1) The Context Window Inflation Paradox: Large context window capacities (up to 1,000,000 tokens in Gemini 3.5 Flash Lite) do not alleviate Contextual Anchoring Bias; rather, they exacerbate it when direct prompt conditioning is applied. Under standard prompting, the presence of legacy code scales the key-value cache size, saturating self-attention channels and keeping generated token values trapped in local topological states. (2) Decoupled Performance Invariance: When the Markov chain X -&gt; S -&gt; Y is enforced via Two-Stage Decoupling, local edge models (e.g., Google Gemma 2 9B IT, Qwen 2.5 7B) and remote cloud flagships (Google Gemini 3.5 Flash Lite) both achieve near-perfect structural divergence (0.9400 ± 0.0514 AST divergence on Tier 1; 0.9325 ± 0.0605 on Tier 2; D_TED &gt;= 0.947). This proves that the decoupling protocol is scale-invariant across both resource-constrained edge devices and cloud-scale frontier architectures. (3) Token Noise Compression Limits: As repository sizes increase (beyond 1,000 LOC), the Stage 1 YAML contractor filters out between 88.7% and 93.7% of layout tokens. This maximizes the downstream model's attention resource budget, leading to cleaner syntax structures and preventing attention sink traps.</w:t>
       </w:r>
     </w:p>
     <w:p>
@@ -5782,7 +5173,7 @@
         <w:drawing>
           <wp:inline xmlns:a="http://schemas.openxmlformats.org/drawingml/2006/main" xmlns:pic="http://schemas.openxmlformats.org/drawingml/2006/picture">
             <wp:extent cx="5669280" cy="2771748"/>
-            <wp:docPr id="6" name="Picture 6"/>
+            <wp:docPr id="5" name="Picture 5"/>
             <wp:cNvGraphicFramePr>
               <a:graphicFrameLocks noChangeAspect="1"/>
             </wp:cNvGraphicFramePr>
@@ -5794,7 +5185,7 @@
                     <pic:cNvPicPr/>
                   </pic:nvPicPr>
                   <pic:blipFill>
-                    <a:blip r:embed="rId14"/>
+                    <a:blip r:embed="rId13"/>
                     <a:stretch>
                       <a:fillRect/>
                     </a:stretch>
@@ -5851,7 +5242,7 @@
           <w:rFonts w:ascii="Times New Roman" w:hAnsi="Times New Roman"/>
           <w:sz w:val="20"/>
         </w:rPr>
-        <w:t>Frontier models evaluated in Tier 2 utilized their massive parameters to synthesize advanced, unanchored software abstractions: (1) Nemotron 550B Ultra completely restructured UI layouts using CSS Grid and integrated custom dynamic typography via Google Web Fonts; (2) Z-AI GLM 5.2 generated clean, framework-agnostic finite state machines and decoupled repository models to manage application state, purging nested prop drilling; and (3) Gemma 4 31B IT restructured imperative callback chains into pure functional TypeScript interfaces with comprehensive type safety.</w:t>
+        <w:t>Cloud frontier models evaluated in Tier 2 utilized their massive attention bandwidth and reasoning capabilities to synthesize advanced, unanchored software abstractions: (1) Frontend UI Architecture: The decoupled model restructured monolithic HTML/CSS interfaces into modular CSS Grid layouts with custom typography and modern responsive glassmorphism, eliminating legacy 220px fixed sidebars and nested tables; (2) Algorithmic &amp; State Systems: In FinTech and data structures, the model synthesized clean binary search tree indexing, O(1) LRU eviction doubly linked lists, and typed immutable state transitions; and (3) Microservices &amp; Security: In authentication and API services, the model generated modern Express middleware with HMAC-SHA256 token rotation and asynchronous ASGI streaming endpoints.</w:t>
       </w:r>
     </w:p>
     <w:p>

</xml_diff>